<commit_message>
Record every leg, not just the gaps
Will, 16 Oct 2026: "Dont give options for recording or not.. record every
track." The itinerary offered a choice on the 29 hops that were not already
a known gap - "no recording needed unless you want it" - which is exactly the
judgement call this document exists to remove. Every one of the 45 legs now
says WALK TO X AND RECORD IT. The known gaps keep a line saying why they
matter most, but nothing is optional.

The map legend says the same: the heavy legs are known gaps, the rest are
"record this leg too", not "travel on".

Also marked as round one, per "This will do as a first round and then we can
collate other missing tracks", so nobody reads it as the whole plateau.

Co-Authored-By: Claude Opus 5 <noreply@anthropic.com>
Claude-Session: https://claude.ai/code/session_01MccBSyiqvhYzrwXhxPb7TF
</commit_message>
<xml_diff>
--- a/outputs/access/MCA_itinerary.docx
+++ b/outputs/access/MCA_itinerary.docx
@@ -26,7 +26,7 @@
           <w:sz w:val="20"/>
           <w:szCs w:val="20"/>
         </w:rPr>
-        <w:t xml:space="preserve">Managalas Conservation Area · where to go, what to do · generated 16 October 2026</w:t>
+        <w:t xml:space="preserve">Managalas Conservation Area · round one · where to go, what to do · generated 16 October 2026</w:t>
       </w:r>
     </w:p>
     <w:p>
@@ -134,7 +134,17 @@
         <w:t xml:space="preserve">RECORD THE WALK</w:t>
       </w:r>
       <w:r>
-        <w:t xml:space="preserve"> - turn the tracker on when you leave and off when you arrive. The route below is arranged so most of the walking is a leg we need recorded anyway.</w:t>
+        <w:t xml:space="preserve"> - turn the tracker on when you leave a stop and off when you reach the next one. </w:t>
+      </w:r>
+      <w:r>
+        <w:rPr>
+          <w:b/>
+          <w:bCs/>
+        </w:rPr>
+        <w:t xml:space="preserve">Every leg, every time.</w:t>
+      </w:r>
+      <w:r>
+        <w:t xml:space="preserve"> Do not decide which ones are worth it. A track we already have costs nothing to record twice; a track we do not have is lost if you walk it with the tracker off.</w:t>
       </w:r>
     </w:p>
     <w:p>
@@ -148,6 +158,14 @@
       </w:pPr>
       <w:r>
         <w:t xml:space="preserve">If a place is not where this says, or is called something else, write that down too. That is as useful as the point.</w:t>
+      </w:r>
+    </w:p>
+    <w:p>
+      <w:pPr>
+        <w:spacing w:after="140" w:before="0"/>
+      </w:pPr>
+      <w:r>
+        <w:t xml:space="preserve">This is the first round. It does not cover every track on the plateau - what is missing after this gets collated into a second round.</w:t>
       </w:r>
     </w:p>
     <w:p>
@@ -173,7 +191,22 @@
         <w:t xml:space="preserve">46 stops</w:t>
       </w:r>
       <w:r>
-        <w:t xml:space="preserve">, 34 of them with something to collect, 63 points in all, and 23 legs to record along the way.</w:t>
+        <w:t xml:space="preserve">, 34 of them with something to collect, 63 points in all.</w:t>
+      </w:r>
+    </w:p>
+    <w:p>
+      <w:pPr>
+        <w:spacing w:after="140" w:before="0"/>
+      </w:pPr>
+      <w:r>
+        <w:rPr>
+          <w:b/>
+          <w:bCs/>
+        </w:rPr>
+        <w:t xml:space="preserve">All 45 legs between stops get recorded.</w:t>
+      </w:r>
+      <w:r>
+        <w:t xml:space="preserve"> 16 of them close a gap we already know about in the map; the rest are recorded because a second copy costs nothing and a missed one cannot be got back.</w:t>
       </w:r>
     </w:p>
     <w:p>
@@ -459,7 +492,7 @@
         <w:spacing w:after="140" w:before="0"/>
       </w:pPr>
       <w:r>
-        <w:t xml:space="preserve">This is one of the legs we need. Our map only has a 2.2 km way round between these two, so the direct track is missing - that is what the recording is for.</w:t>
+        <w:t xml:space="preserve">This one matters most: our map has only a 2.2 km way round between these two, so the direct track is missing altogether.</w:t>
       </w:r>
     </w:p>
     <w:p>
@@ -514,10 +547,10 @@
           <w:b/>
           <w:bCs/>
         </w:rPr>
-        <w:t xml:space="preserve">Walk on to Semahara Tahama</w:t>
-      </w:r>
-      <w:r>
-        <w:t xml:space="preserve"> - about 1.9 km in a straight line. No recording needed unless you want it.</w:t>
+        <w:t xml:space="preserve">WALK TO SEMAHARA TAHAMA AND RECORD IT.</w:t>
+      </w:r>
+      <w:r>
+        <w:t xml:space="preserve"> About 1.9 km in a straight line.</w:t>
       </w:r>
     </w:p>
     <w:p>
@@ -610,7 +643,7 @@
         <w:spacing w:after="140" w:before="0"/>
       </w:pPr>
       <w:r>
-        <w:t xml:space="preserve">This is one of the legs we need. Our map only has a 14.8 km way round between these two, so the direct track is missing - that is what the recording is for.</w:t>
+        <w:t xml:space="preserve">This one matters most: our map has only a 14.8 km way round between these two, so the direct track is missing altogether.</w:t>
       </w:r>
     </w:p>
     <w:p>
@@ -703,7 +736,7 @@
         <w:spacing w:after="140" w:before="0"/>
       </w:pPr>
       <w:r>
-        <w:t xml:space="preserve">This is one of the legs we need. Our map only has a 31.5 km way round between these two, so the direct track is missing - that is what the recording is for.</w:t>
+        <w:t xml:space="preserve">This one matters most: our map has only a 31.5 km way round between these two, so the direct track is missing altogether.</w:t>
       </w:r>
     </w:p>
     <w:p>
@@ -758,10 +791,10 @@
           <w:b/>
           <w:bCs/>
         </w:rPr>
-        <w:t xml:space="preserve">Walk on to Gewoya</w:t>
-      </w:r>
-      <w:r>
-        <w:t xml:space="preserve"> - about 6.6 km in a straight line. No recording needed unless you want it.</w:t>
+        <w:t xml:space="preserve">WALK TO GEWOYA AND RECORD IT.</w:t>
+      </w:r>
+      <w:r>
+        <w:t xml:space="preserve"> About 6.6 km in a straight line.</w:t>
       </w:r>
     </w:p>
     <w:p>
@@ -923,10 +956,10 @@
           <w:b/>
           <w:bCs/>
         </w:rPr>
-        <w:t xml:space="preserve">Walk on to Wayei</w:t>
-      </w:r>
-      <w:r>
-        <w:t xml:space="preserve"> - about 13.4 km in a straight line. No recording needed unless you want it.</w:t>
+        <w:t xml:space="preserve">WALK TO WAYEI AND RECORD IT.</w:t>
+      </w:r>
+      <w:r>
+        <w:t xml:space="preserve"> About 13.4 km in a straight line.</w:t>
       </w:r>
     </w:p>
     <w:p>
@@ -992,7 +1025,7 @@
         <w:spacing w:after="140" w:before="0"/>
       </w:pPr>
       <w:r>
-        <w:t xml:space="preserve">This is one of the legs we need. Our map only has a 22.3 km way round between these two, so the direct track is missing - that is what the recording is for.</w:t>
+        <w:t xml:space="preserve">This one matters most: our map has only a 22.3 km way round between these two, so the direct track is missing altogether.</w:t>
       </w:r>
     </w:p>
     <w:p>
@@ -1047,10 +1080,10 @@
           <w:b/>
           <w:bCs/>
         </w:rPr>
-        <w:t xml:space="preserve">Walk on to Yoivi</w:t>
-      </w:r>
-      <w:r>
-        <w:t xml:space="preserve"> - about 3.3 km in a straight line. No recording needed unless you want it.</w:t>
+        <w:t xml:space="preserve">WALK TO YOIVI AND RECORD IT.</w:t>
+      </w:r>
+      <w:r>
+        <w:t xml:space="preserve"> About 3.3 km in a straight line.</w:t>
       </w:r>
     </w:p>
     <w:p>
@@ -1212,10 +1245,10 @@
           <w:b/>
           <w:bCs/>
         </w:rPr>
-        <w:t xml:space="preserve">Walk on to Marasi</w:t>
-      </w:r>
-      <w:r>
-        <w:t xml:space="preserve"> - about 2.4 km in a straight line. No recording needed unless you want it.</w:t>
+        <w:t xml:space="preserve">WALK TO MARASI AND RECORD IT.</w:t>
+      </w:r>
+      <w:r>
+        <w:t xml:space="preserve"> About 2.4 km in a straight line.</w:t>
       </w:r>
     </w:p>
     <w:p>
@@ -1297,10 +1330,10 @@
           <w:b/>
           <w:bCs/>
         </w:rPr>
-        <w:t xml:space="preserve">Walk on to Manusi</w:t>
-      </w:r>
-      <w:r>
-        <w:t xml:space="preserve"> - about 0.4 km in a straight line. No recording needed unless you want it.</w:t>
+        <w:t xml:space="preserve">WALK TO MANUSI AND RECORD IT.</w:t>
+      </w:r>
+      <w:r>
+        <w:t xml:space="preserve"> About 0.4 km in a straight line.</w:t>
       </w:r>
     </w:p>
     <w:p>
@@ -1382,10 +1415,10 @@
           <w:b/>
           <w:bCs/>
         </w:rPr>
-        <w:t xml:space="preserve">Walk on to Niniuri</w:t>
-      </w:r>
-      <w:r>
-        <w:t xml:space="preserve"> - about 1.3 km in a straight line. No recording needed unless you want it.</w:t>
+        <w:t xml:space="preserve">WALK TO NINIURI AND RECORD IT.</w:t>
+      </w:r>
+      <w:r>
+        <w:t xml:space="preserve"> About 1.3 km in a straight line.</w:t>
       </w:r>
     </w:p>
     <w:p>
@@ -1451,7 +1484,7 @@
         <w:spacing w:after="140" w:before="0"/>
       </w:pPr>
       <w:r>
-        <w:t xml:space="preserve">This is one of the legs we need. Our map only has a 15.3 km way round between these two, so the direct track is missing - that is what the recording is for.</w:t>
+        <w:t xml:space="preserve">This one matters most: our map has only a 15.3 km way round between these two, so the direct track is missing altogether.</w:t>
       </w:r>
     </w:p>
     <w:p>
@@ -1573,10 +1606,10 @@
           <w:b/>
           <w:bCs/>
         </w:rPr>
-        <w:t xml:space="preserve">Walk on to Koruwo</w:t>
-      </w:r>
-      <w:r>
-        <w:t xml:space="preserve"> - about 8.9 km in a straight line. No recording needed unless you want it.</w:t>
+        <w:t xml:space="preserve">WALK TO KORUWO AND RECORD IT.</w:t>
+      </w:r>
+      <w:r>
+        <w:t xml:space="preserve"> About 8.9 km in a straight line.</w:t>
       </w:r>
     </w:p>
     <w:p>
@@ -1789,7 +1822,7 @@
         <w:spacing w:after="140" w:before="0"/>
       </w:pPr>
       <w:r>
-        <w:t xml:space="preserve">This is one of the legs we need. Our map only has a 9.7 km way round between these two, so the direct track is missing - that is what the recording is for.</w:t>
+        <w:t xml:space="preserve">This one matters most: our map has only a 9.7 km way round between these two, so the direct track is missing altogether.</w:t>
       </w:r>
     </w:p>
     <w:p>
@@ -1871,10 +1904,10 @@
           <w:b/>
           <w:bCs/>
         </w:rPr>
-        <w:t xml:space="preserve">Walk on to Bodoimo</w:t>
-      </w:r>
-      <w:r>
-        <w:t xml:space="preserve"> - about 2.2 km in a straight line. No recording needed unless you want it.</w:t>
+        <w:t xml:space="preserve">WALK TO BODOIMO AND RECORD IT.</w:t>
+      </w:r>
+      <w:r>
+        <w:t xml:space="preserve"> About 2.2 km in a straight line.</w:t>
       </w:r>
     </w:p>
     <w:p>
@@ -1956,10 +1989,10 @@
           <w:b/>
           <w:bCs/>
         </w:rPr>
-        <w:t xml:space="preserve">Walk on to Umbuara</w:t>
-      </w:r>
-      <w:r>
-        <w:t xml:space="preserve"> - about 1.6 km in a straight line. No recording needed unless you want it.</w:t>
+        <w:t xml:space="preserve">WALK TO UMBUARA AND RECORD IT.</w:t>
+      </w:r>
+      <w:r>
+        <w:t xml:space="preserve"> About 1.6 km in a straight line.</w:t>
       </w:r>
     </w:p>
     <w:p>
@@ -2136,10 +2169,10 @@
           <w:b/>
           <w:bCs/>
         </w:rPr>
-        <w:t xml:space="preserve">Walk on to Anatua</w:t>
-      </w:r>
-      <w:r>
-        <w:t xml:space="preserve"> - about 2.2 km in a straight line. No recording needed unless you want it.</w:t>
+        <w:t xml:space="preserve">WALK TO ANATUA AND RECORD IT.</w:t>
+      </w:r>
+      <w:r>
+        <w:t xml:space="preserve"> About 2.2 km in a straight line.</w:t>
       </w:r>
     </w:p>
     <w:p>
@@ -2236,10 +2269,10 @@
           <w:b/>
           <w:bCs/>
         </w:rPr>
-        <w:t xml:space="preserve">Walk on to Serefuna</w:t>
-      </w:r>
-      <w:r>
-        <w:t xml:space="preserve"> - about 1.9 km in a straight line. No recording needed unless you want it.</w:t>
+        <w:t xml:space="preserve">WALK TO SEREFUNA AND RECORD IT.</w:t>
+      </w:r>
+      <w:r>
+        <w:t xml:space="preserve"> About 1.9 km in a straight line.</w:t>
       </w:r>
     </w:p>
     <w:p>
@@ -2321,10 +2354,10 @@
           <w:b/>
           <w:bCs/>
         </w:rPr>
-        <w:t xml:space="preserve">Walk on to Kokoro</w:t>
-      </w:r>
-      <w:r>
-        <w:t xml:space="preserve"> - about 1.2 km in a straight line. No recording needed unless you want it.</w:t>
+        <w:t xml:space="preserve">WALK TO KOKORO AND RECORD IT.</w:t>
+      </w:r>
+      <w:r>
+        <w:t xml:space="preserve"> About 1.2 km in a straight line.</w:t>
       </w:r>
     </w:p>
     <w:p>
@@ -2406,10 +2439,10 @@
           <w:b/>
           <w:bCs/>
         </w:rPr>
-        <w:t xml:space="preserve">Walk on to Itokama</w:t>
-      </w:r>
-      <w:r>
-        <w:t xml:space="preserve"> - about 3.7 km in a straight line. No recording needed unless you want it.</w:t>
+        <w:t xml:space="preserve">WALK TO ITOKAMA AND RECORD IT.</w:t>
+      </w:r>
+      <w:r>
+        <w:t xml:space="preserve"> About 3.7 km in a straight line.</w:t>
       </w:r>
     </w:p>
     <w:p>
@@ -2611,10 +2644,10 @@
           <w:b/>
           <w:bCs/>
         </w:rPr>
-        <w:t xml:space="preserve">Walk on to Naokanane</w:t>
-      </w:r>
-      <w:r>
-        <w:t xml:space="preserve"> - about 1.2 km in a straight line. No recording needed unless you want it.</w:t>
+        <w:t xml:space="preserve">WALK TO NAOKANANE AND RECORD IT.</w:t>
+      </w:r>
+      <w:r>
+        <w:t xml:space="preserve"> About 1.2 km in a straight line.</w:t>
       </w:r>
     </w:p>
     <w:p>
@@ -2696,10 +2729,10 @@
           <w:b/>
           <w:bCs/>
         </w:rPr>
-        <w:t xml:space="preserve">Walk on to Umuate</w:t>
-      </w:r>
-      <w:r>
-        <w:t xml:space="preserve"> - about 6.7 km in a straight line. No recording needed unless you want it.</w:t>
+        <w:t xml:space="preserve">WALK TO UMUATE AND RECORD IT.</w:t>
+      </w:r>
+      <w:r>
+        <w:t xml:space="preserve"> About 6.7 km in a straight line.</w:t>
       </w:r>
     </w:p>
     <w:p>
@@ -2781,10 +2814,10 @@
           <w:b/>
           <w:bCs/>
         </w:rPr>
-        <w:t xml:space="preserve">Walk on to Aiari</w:t>
-      </w:r>
-      <w:r>
-        <w:t xml:space="preserve"> - about 9.8 km in a straight line. No recording needed unless you want it.</w:t>
+        <w:t xml:space="preserve">WALK TO AIARI AND RECORD IT.</w:t>
+      </w:r>
+      <w:r>
+        <w:t xml:space="preserve"> About 9.8 km in a straight line.</w:t>
       </w:r>
     </w:p>
     <w:p>
@@ -2957,7 +2990,7 @@
         <w:spacing w:after="140" w:before="0"/>
       </w:pPr>
       <w:r>
-        <w:t xml:space="preserve">This is one of the legs we need. Our map only has a 23.1 km way round between these two, so the direct track is missing - that is what the recording is for.</w:t>
+        <w:t xml:space="preserve">This one matters most: our map has only a 23.1 km way round between these two, so the direct track is missing altogether.</w:t>
       </w:r>
     </w:p>
     <w:p>
@@ -3090,7 +3123,7 @@
         <w:spacing w:after="140" w:before="0"/>
       </w:pPr>
       <w:r>
-        <w:t xml:space="preserve">This is one of the legs we need. Our map only has a 23.5 km way round between these two, so the direct track is missing - that is what the recording is for.</w:t>
+        <w:t xml:space="preserve">This one matters most: our map has only a 23.5 km way round between these two, so the direct track is missing altogether.</w:t>
       </w:r>
     </w:p>
     <w:p>
@@ -3212,10 +3245,10 @@
           <w:b/>
           <w:bCs/>
         </w:rPr>
-        <w:t xml:space="preserve">Walk on to Singata</w:t>
-      </w:r>
-      <w:r>
-        <w:t xml:space="preserve"> - about 20.5 km in a straight line. No recording needed unless you want it.</w:t>
+        <w:t xml:space="preserve">WALK TO SINGATA AND RECORD IT.</w:t>
+      </w:r>
+      <w:r>
+        <w:t xml:space="preserve"> About 20.5 km in a straight line.</w:t>
       </w:r>
     </w:p>
     <w:p>
@@ -3281,7 +3314,7 @@
         <w:spacing w:after="140" w:before="0"/>
       </w:pPr>
       <w:r>
-        <w:t xml:space="preserve">This is one of the legs we need. Our map only has a 31.0 km way round between these two, so the direct track is missing - that is what the recording is for.</w:t>
+        <w:t xml:space="preserve">This one matters most: our map has only a 31.0 km way round between these two, so the direct track is missing altogether.</w:t>
       </w:r>
     </w:p>
     <w:p>
@@ -3429,7 +3462,7 @@
         <w:spacing w:after="140" w:before="0"/>
       </w:pPr>
       <w:r>
-        <w:t xml:space="preserve">This is one of the legs we need. Our map only has a 43.3 km way round between these two, so the direct track is missing - that is what the recording is for.</w:t>
+        <w:t xml:space="preserve">This one matters most: our map has only a 43.3 km way round between these two, so the direct track is missing altogether.</w:t>
       </w:r>
     </w:p>
     <w:p>
@@ -3495,7 +3528,7 @@
         <w:spacing w:after="140" w:before="0"/>
       </w:pPr>
       <w:r>
-        <w:t xml:space="preserve">This is one of the legs we need. Our map only has a 48.0 km way round between these two, so the direct track is missing - that is what the recording is for.</w:t>
+        <w:t xml:space="preserve">This one matters most: our map has only a 48.0 km way round between these two, so the direct track is missing altogether.</w:t>
       </w:r>
     </w:p>
     <w:p>
@@ -3550,10 +3583,10 @@
           <w:b/>
           <w:bCs/>
         </w:rPr>
-        <w:t xml:space="preserve">Walk on to Gora</w:t>
-      </w:r>
-      <w:r>
-        <w:t xml:space="preserve"> - about 23.6 km in a straight line. No recording needed unless you want it.</w:t>
+        <w:t xml:space="preserve">WALK TO GORA AND RECORD IT.</w:t>
+      </w:r>
+      <w:r>
+        <w:t xml:space="preserve"> About 23.6 km in a straight line.</w:t>
       </w:r>
     </w:p>
     <w:p>
@@ -3770,10 +3803,10 @@
           <w:b/>
           <w:bCs/>
         </w:rPr>
-        <w:t xml:space="preserve">Walk on to Natanga</w:t>
-      </w:r>
-      <w:r>
-        <w:t xml:space="preserve"> - about 9.2 km in a straight line. No recording needed unless you want it.</w:t>
+        <w:t xml:space="preserve">WALK TO NATANGA AND RECORD IT.</w:t>
+      </w:r>
+      <w:r>
+        <w:t xml:space="preserve"> About 9.2 km in a straight line.</w:t>
       </w:r>
     </w:p>
     <w:p>
@@ -3895,10 +3928,10 @@
           <w:b/>
           <w:bCs/>
         </w:rPr>
-        <w:t xml:space="preserve">Walk on to Jorua</w:t>
-      </w:r>
-      <w:r>
-        <w:t xml:space="preserve"> - about 2.4 km in a straight line. No recording needed unless you want it.</w:t>
+        <w:t xml:space="preserve">WALK TO JORUA AND RECORD IT.</w:t>
+      </w:r>
+      <w:r>
+        <w:t xml:space="preserve"> About 2.4 km in a straight line.</w:t>
       </w:r>
     </w:p>
     <w:p>
@@ -3980,10 +4013,10 @@
           <w:b/>
           <w:bCs/>
         </w:rPr>
-        <w:t xml:space="preserve">Walk on to Siribu</w:t>
-      </w:r>
-      <w:r>
-        <w:t xml:space="preserve"> - about 1.9 km in a straight line. No recording needed unless you want it.</w:t>
+        <w:t xml:space="preserve">WALK TO SIRIBU AND RECORD IT.</w:t>
+      </w:r>
+      <w:r>
+        <w:t xml:space="preserve"> About 1.9 km in a straight line.</w:t>
       </w:r>
     </w:p>
     <w:p>
@@ -4076,7 +4109,7 @@
         <w:spacing w:after="140" w:before="0"/>
       </w:pPr>
       <w:r>
-        <w:t xml:space="preserve">This is one of the legs we need. Our map only has a 9.0 km way round between these two, so the direct track is missing - that is what the recording is for.</w:t>
+        <w:t xml:space="preserve">This one matters most: our map has only a 9.0 km way round between these two, so the direct track is missing altogether.</w:t>
       </w:r>
     </w:p>
     <w:p>
@@ -4158,10 +4191,10 @@
           <w:b/>
           <w:bCs/>
         </w:rPr>
-        <w:t xml:space="preserve">Walk on to Dea</w:t>
-      </w:r>
-      <w:r>
-        <w:t xml:space="preserve"> - about 1.4 km in a straight line. No recording needed unless you want it.</w:t>
+        <w:t xml:space="preserve">WALK TO DEA AND RECORD IT.</w:t>
+      </w:r>
+      <w:r>
+        <w:t xml:space="preserve"> About 1.4 km in a straight line.</w:t>
       </w:r>
     </w:p>
     <w:p>
@@ -4338,10 +4371,10 @@
           <w:b/>
           <w:bCs/>
         </w:rPr>
-        <w:t xml:space="preserve">Walk on to Tabuane</w:t>
-      </w:r>
-      <w:r>
-        <w:t xml:space="preserve"> - about 1.2 km in a straight line. No recording needed unless you want it.</w:t>
+        <w:t xml:space="preserve">WALK TO TABUANE AND RECORD IT.</w:t>
+      </w:r>
+      <w:r>
+        <w:t xml:space="preserve"> About 1.2 km in a straight line.</w:t>
       </w:r>
     </w:p>
     <w:p>
@@ -4423,10 +4456,10 @@
           <w:b/>
           <w:bCs/>
         </w:rPr>
-        <w:t xml:space="preserve">Walk on to Koeno</w:t>
-      </w:r>
-      <w:r>
-        <w:t xml:space="preserve"> - about 1.7 km in a straight line. No recording needed unless you want it.</w:t>
+        <w:t xml:space="preserve">WALK TO KOENO AND RECORD IT.</w:t>
+      </w:r>
+      <w:r>
+        <w:t xml:space="preserve"> About 1.7 km in a straight line.</w:t>
       </w:r>
     </w:p>
     <w:p>
@@ -4508,10 +4541,10 @@
           <w:b/>
           <w:bCs/>
         </w:rPr>
-        <w:t xml:space="preserve">Walk on to Numba</w:t>
-      </w:r>
-      <w:r>
-        <w:t xml:space="preserve"> - about 1.5 km in a straight line. No recording needed unless you want it.</w:t>
+        <w:t xml:space="preserve">WALK TO NUMBA AND RECORD IT.</w:t>
+      </w:r>
+      <w:r>
+        <w:t xml:space="preserve"> About 1.5 km in a straight line.</w:t>
       </w:r>
     </w:p>
     <w:p>
@@ -4608,10 +4641,10 @@
           <w:b/>
           <w:bCs/>
         </w:rPr>
-        <w:t xml:space="preserve">Walk on to Sakarina</w:t>
-      </w:r>
-      <w:r>
-        <w:t xml:space="preserve"> - about 1.7 km in a straight line. No recording needed unless you want it.</w:t>
+        <w:t xml:space="preserve">WALK TO SAKARINA AND RECORD IT.</w:t>
+      </w:r>
+      <w:r>
+        <w:t xml:space="preserve"> About 1.7 km in a straight line.</w:t>
       </w:r>
     </w:p>
     <w:p>
@@ -4693,10 +4726,10 @@
           <w:b/>
           <w:bCs/>
         </w:rPr>
-        <w:t xml:space="preserve">Walk on to Kaura</w:t>
-      </w:r>
-      <w:r>
-        <w:t xml:space="preserve"> - about 0.9 km in a straight line. No recording needed unless you want it.</w:t>
+        <w:t xml:space="preserve">WALK TO KAURA AND RECORD IT.</w:t>
+      </w:r>
+      <w:r>
+        <w:t xml:space="preserve"> About 0.9 km in a straight line.</w:t>
       </w:r>
     </w:p>
     <w:p>
@@ -4789,7 +4822,7 @@
         <w:spacing w:after="140" w:before="0"/>
       </w:pPr>
       <w:r>
-        <w:t xml:space="preserve">This is one of the legs we need. Our map only has a 6.0 km way round between these two, so the direct track is missing - that is what the recording is for.</w:t>
+        <w:t xml:space="preserve">This one matters most: our map has only a 6.0 km way round between these two, so the direct track is missing altogether.</w:t>
       </w:r>
     </w:p>
     <w:p>
@@ -4844,10 +4877,10 @@
           <w:b/>
           <w:bCs/>
         </w:rPr>
-        <w:t xml:space="preserve">Walk on to Bioi</w:t>
-      </w:r>
-      <w:r>
-        <w:t xml:space="preserve"> - about 6.6 km in a straight line. No recording needed unless you want it.</w:t>
+        <w:t xml:space="preserve">WALK TO BIOI AND RECORD IT.</w:t>
+      </w:r>
+      <w:r>
+        <w:t xml:space="preserve"> About 6.6 km in a straight line.</w:t>
       </w:r>
     </w:p>
     <w:p>
@@ -4913,7 +4946,7 @@
         <w:spacing w:after="140" w:before="0"/>
       </w:pPr>
       <w:r>
-        <w:t xml:space="preserve">This is one of the legs we need. Our map only has a 7.6 km way round between these two, so the direct track is missing - that is what the recording is for.</w:t>
+        <w:t xml:space="preserve">This one matters most: our map has only a 7.6 km way round between these two, so the direct track is missing altogether.</w:t>
       </w:r>
     </w:p>
     <w:p>
@@ -5046,7 +5079,7 @@
         <w:spacing w:after="140" w:before="0"/>
       </w:pPr>
       <w:r>
-        <w:t xml:space="preserve">This is one of the legs we need. Our map only has a 33.6 km way round between these two, so the direct track is missing - that is what the recording is for.</w:t>
+        <w:t xml:space="preserve">This one matters most: our map has only a 33.6 km way round between these two, so the direct track is missing altogether.</w:t>
       </w:r>
     </w:p>
     <w:p>
@@ -5112,7 +5145,7 @@
         <w:spacing w:after="140" w:before="0"/>
       </w:pPr>
       <w:r>
-        <w:t xml:space="preserve">This is one of the legs we need. Our map only has a 63.0 km way round between these two, so the direct track is missing - that is what the recording is for.</w:t>
+        <w:t xml:space="preserve">This one matters most: our map has only a 63.0 km way round between these two, so the direct track is missing altogether.</w:t>
       </w:r>
     </w:p>
     <w:p>

</xml_diff>

<commit_message>
Say what to do when a village cannot be entered
Will, 16 Oct 2026: if a village cannot be entered for any reason, skip it and
restart at the next available village by an alternative route. Standing
instruction near the top, not buried at a stop, because it applies anywhere
on the round.

It also says to keep the tracker running on the way out: a detour forced on
him is a track in its own right and probably one nobody has recorded. And to
write down which village was skipped and why - without the note a gap in the
returned data looks like an unfinished list, and someone gets sent back.

Co-Authored-By: Claude Opus 5 <noreply@anthropic.com>
Claude-Session: https://claude.ai/code/session_01MccBSyiqvhYzrwXhxPb7TF
</commit_message>
<xml_diff>
--- a/outputs/access/MCA_itinerary.docx
+++ b/outputs/access/MCA_itinerary.docx
@@ -94,7 +94,7 @@
           <w:b/>
           <w:bCs/>
         </w:rPr>
-        <w:t xml:space="preserve">Two kinds of job.</w:t>
+        <w:t xml:space="preserve">The two jobs.</w:t>
       </w:r>
     </w:p>
     <w:p>
@@ -151,6 +151,87 @@
       <w:pPr>
         <w:spacing w:after="100" w:before="0"/>
       </w:pPr>
+    </w:p>
+    <w:p>
+      <w:pPr>
+        <w:spacing w:after="140" w:before="0"/>
+      </w:pPr>
+      <w:r>
+        <w:rPr>
+          <w:b/>
+          <w:bCs/>
+        </w:rPr>
+        <w:t xml:space="preserve">If you cannot get into a village, skip it.</w:t>
+      </w:r>
+    </w:p>
+    <w:p>
+      <w:pPr>
+        <w:spacing w:after="140" w:before="0"/>
+      </w:pPr>
+      <w:r>
+        <w:t xml:space="preserve">It does not matter what the reason is - permission refused, a dispute, a funeral, a flooded crossing, sickness, or something nobody explains. Do not argue it, do not wait it out, and do not go round the back. Leave, and pick the list up at the next number you can reach, by whatever route is open to you.</w:t>
+      </w:r>
+    </w:p>
+    <w:p>
+      <w:pPr>
+        <w:spacing w:after="140" w:before="0"/>
+      </w:pPr>
+      <w:r>
+        <w:t xml:space="preserve">Two things to do when that happens:</w:t>
+      </w:r>
+    </w:p>
+    <w:p>
+      <w:pPr>
+        <w:pStyle w:val="ListParagraph"/>
+        <w:numPr>
+          <w:ilvl w:val="0"/>
+          <w:numId w:val="2"/>
+        </w:numPr>
+        <w:spacing w:after="40" w:before="20"/>
+      </w:pPr>
+      <w:r>
+        <w:rPr>
+          <w:b/>
+          <w:bCs/>
+        </w:rPr>
+        <w:t xml:space="preserve">Keep the tracker running on the way out and on to the next place.</w:t>
+      </w:r>
+      <w:r>
+        <w:t xml:space="preserve"> The way round is a track in its own right and probably one nobody has recorded. A detour forced on you is still worth having.</w:t>
+      </w:r>
+    </w:p>
+    <w:p>
+      <w:pPr>
+        <w:pStyle w:val="ListParagraph"/>
+        <w:numPr>
+          <w:ilvl w:val="0"/>
+          <w:numId w:val="2"/>
+        </w:numPr>
+        <w:spacing w:after="40" w:before="20"/>
+      </w:pPr>
+      <w:r>
+        <w:rPr>
+          <w:b/>
+          <w:bCs/>
+        </w:rPr>
+        <w:t xml:space="preserve">Write down which village you skipped and why.</w:t>
+      </w:r>
+      <w:r>
+        <w:t xml:space="preserve"> A skipped village with a reason is information. A skipped village with no note just looks like the list was never finished, and somebody will send you back.</w:t>
+      </w:r>
+    </w:p>
+    <w:p>
+      <w:pPr>
+        <w:spacing w:after="100" w:before="0"/>
+      </w:pPr>
+    </w:p>
+    <w:p>
+      <w:pPr>
+        <w:spacing w:after="140" w:before="0"/>
+      </w:pPr>
+      <w:r>
+        <w:t xml:space="preserve">Nothing on this list is worth a confrontation. The stops that get missed go into the next round.</w:t>
+      </w:r>
     </w:p>
     <w:p>
       <w:pPr>

</xml_diff>

<commit_message>
Put the map in the document, full page and landscape
The map was a separate file, which means it travels separately and gets lost.
md_to_docx.js now takes an optional map as its fifth argument and drops it on
its own landscape page between the contents and the first stop: Word takes a
page size per section, so the document is portrait, landscape, portrait in
three sections rather than one.

The image is sized from the PNG header to fill the landscape text area -
10.69 x 6.42 inches here - so it fills the page whatever the figure's shape.
The manual page break after the contents is skipped when a map follows, since
the landscape section already starts a page and both together left a blank
one.

Co-Authored-By: Claude Opus 5 <noreply@anthropic.com>
Claude-Session: https://claude.ai/code/session_01MccBSyiqvhYzrwXhxPb7TF
</commit_message>
<xml_diff>
--- a/outputs/access/MCA_itinerary.docx
+++ b/outputs/access/MCA_itinerary.docx
@@ -63,9 +63,70 @@
       </w:sdtContent>
     </w:sdt>
     <w:p>
-      <w:r>
-        <w:br w:type="page"/>
-      </w:r>
+      <w:pPr>
+        <w:sectPr>
+          <w:pgSz w:w="11906" w:h="16838" w:orient="portrait"/>
+          <w:pgMar w:top="1440" w:right="1440" w:bottom="1440" w:left="1440" w:header="708" w:footer="708" w:gutter="0"/>
+          <w:pgNumType/>
+          <w:docGrid w:linePitch="360"/>
+        </w:sectPr>
+      </w:pPr>
+    </w:p>
+    <w:p>
+      <w:pPr>
+        <w:spacing w:after="0" w:before="0"/>
+        <w:jc w:val="center"/>
+      </w:pPr>
+      <w:r>
+        <w:drawing>
+          <wp:inline distT="0" distB="0" distL="0" distR="0">
+            <wp:extent cx="9772650" cy="5867400"/>
+            <wp:effectExtent t="0" r="0" b="0" l="0"/>
+            <wp:docPr id="1" name="" descr="" title=""/>
+            <wp:cNvGraphicFramePr>
+              <a:graphicFrameLocks xmlns:a="http://schemas.openxmlformats.org/drawingml/2006/main" noChangeAspect="1"/>
+            </wp:cNvGraphicFramePr>
+            <a:graphic xmlns:a="http://schemas.openxmlformats.org/drawingml/2006/main">
+              <a:graphicData uri="http://schemas.openxmlformats.org/drawingml/2006/picture">
+                <pic:pic xmlns:pic="http://schemas.openxmlformats.org/drawingml/2006/picture">
+                  <pic:nvPicPr>
+                    <pic:cNvPr id="0" name="" descr=""/>
+                    <pic:cNvPicPr>
+                      <a:picLocks noChangeAspect="1" noChangeArrowheads="1"/>
+                    </pic:cNvPicPr>
+                  </pic:nvPicPr>
+                  <pic:blipFill>
+                    <a:blip r:embed="rId7" cstate="none"/>
+                    <a:srcRect/>
+                    <a:stretch>
+                      <a:fillRect/>
+                    </a:stretch>
+                  </pic:blipFill>
+                  <pic:spPr bwMode="auto">
+                    <a:xfrm>
+                      <a:off x="0" y="0"/>
+                      <a:ext cx="9772650" cy="5867400"/>
+                    </a:xfrm>
+                    <a:prstGeom prst="rect">
+                      <a:avLst/>
+                    </a:prstGeom>
+                  </pic:spPr>
+                </pic:pic>
+              </a:graphicData>
+            </a:graphic>
+          </wp:inline>
+        </w:drawing>
+      </w:r>
+    </w:p>
+    <w:p>
+      <w:pPr>
+        <w:sectPr>
+          <w:pgSz w:w="16838" w:h="11906" w:orient="landscape"/>
+          <w:pgMar w:top="720" w:right="720" w:bottom="720" w:left="720" w:header="708" w:footer="708" w:gutter="0"/>
+          <w:pgNumType/>
+          <w:docGrid w:linePitch="360"/>
+        </w:sectPr>
+      </w:pPr>
     </w:p>
     <w:p>
       <w:pPr>

</xml_diff>

<commit_message>
Jakiro and Buangfu are hamlets of Kokoro
Confirmed by Will, 18 Oct 2026. Both get a position from Russell's own
tracks - Jakiro from where the 7 Aug "Anatua to Jakiro" walk ended, Buangfu
from where the "Buangfu to Kuai" walk started - so the provenance says track
endpoint, not surveyed point. Buamfu is Will's spelling and carries the
coordinates again rather than pointing at the Buangfu row, because
candidates() does not follow an alias to another alias.

With Namieta and Maragane from the waypoint file that is four hamlets over
about 1.5 km, so stop 20 now says so and asks which one the aid post is in.
Anatua gets the same treatment for Anatua 1 and Anatua 2. STOP_NOTES exists
for exactly this: a field fact that changes what someone does on arrival,
kept apart from the ASK_AT notes, which are about where to go at all.

Co-Authored-By: Claude Opus 5 <noreply@anthropic.com>
Claude-Session: https://claude.ai/code/session_01MccBSyiqvhYzrwXhxPb7TF
</commit_message>
<xml_diff>
--- a/outputs/access/MCA_itinerary.docx
+++ b/outputs/access/MCA_itinerary.docx
@@ -2326,6 +2326,21 @@
           <w:b/>
           <w:bCs/>
         </w:rPr>
+        <w:t xml:space="preserve">Anatua is a long village with Anatua 1 and Anatua 2 defined. Map both ends, not one point.</w:t>
+      </w:r>
+    </w:p>
+    <w:p>
+      <w:pPr>
+        <w:spacing w:after="140" w:before="0"/>
+      </w:pPr>
+      <w:r>
+        <w:t xml:space="preserve">&gt; </w:t>
+      </w:r>
+      <w:r>
+        <w:rPr>
+          <w:b/>
+          <w:bCs/>
+        </w:rPr>
         <w:t xml:space="preserve">Anatua is a long village and they have defined Anatua 1 and Anatua 2 - map both ends, not one point.</w:t>
       </w:r>
     </w:p>
@@ -2497,6 +2512,21 @@
       </w:r>
       <w:r>
         <w:t xml:space="preserve">  (placed by the team)</w:t>
+      </w:r>
+    </w:p>
+    <w:p>
+      <w:pPr>
+        <w:spacing w:after="140" w:before="0"/>
+      </w:pPr>
+      <w:r>
+        <w:t xml:space="preserve">&gt; </w:t>
+      </w:r>
+      <w:r>
+        <w:rPr>
+          <w:b/>
+          <w:bCs/>
+        </w:rPr>
+        <w:t xml:space="preserve">Kokoro is at least four hamlets - Namieta, Maragane, Jakiro and Buangfu (Buamfu), spread over about a kilometre and a half. Write down which hamlet the aid post is actually in.</w:t>
       </w:r>
     </w:p>
     <w:p>

</xml_diff>